<commit_message>
Removed custody object error
</commit_message>
<xml_diff>
--- a/backend/app/services/doc_engine/templates/en/custody.docx
+++ b/backend/app/services/doc_engine/templates/en/custody.docx
@@ -1,6 +1,6 @@
 
 <file path=word/document.xml><?xml version="1.0" encoding="utf-8"?>
-<w:document xmlns:wpc="http://schemas.microsoft.com/office/word/2010/wordprocessingCanvas" xmlns:cx="http://schemas.microsoft.com/office/drawing/2014/chartex" xmlns:cx1="http://schemas.microsoft.com/office/drawing/2015/9/8/chartex" xmlns:cx2="http://schemas.microsoft.com/office/drawing/2015/10/21/chartex" xmlns:cx3="http://schemas.microsoft.com/office/drawing/2016/5/9/chartex" xmlns:cx4="http://schemas.microsoft.com/office/drawing/2016/5/10/chartex" xmlns:cx5="http://schemas.microsoft.com/office/drawing/2016/5/11/chartex" xmlns:cx6="http://schemas.microsoft.com/office/drawing/2016/5/12/chartex" xmlns:cx7="http://schemas.microsoft.com/office/drawing/2016/5/13/chartex" xmlns:cx8="http://schemas.microsoft.com/office/drawing/2016/5/14/chartex" xmlns:mc="http://schemas.openxmlformats.org/markup-compatibility/2006" xmlns:aink="http://schemas.microsoft.com/office/drawing/2016/ink" xmlns:am3d="http://schemas.microsoft.com/office/drawing/2017/model3d" xmlns:o="urn:schemas-microsoft-com:office:office" xmlns:oel="http://schemas.microsoft.com/office/2019/extlst" xmlns:r="http://schemas.openxmlformats.org/officeDocument/2006/relationships" xmlns:m="http://schemas.openxmlformats.org/officeDocument/2006/math" xmlns:v="urn:schemas-microsoft-com:vml" xmlns:wp14="http://schemas.microsoft.com/office/word/2010/wordprocessingDrawing" xmlns:wp="http://schemas.openxmlformats.org/drawingml/2006/wordprocessingDrawing" xmlns:w10="urn:schemas-microsoft-com:office:word" xmlns:w="http://schemas.openxmlformats.org/wordprocessingml/2006/main" xmlns:w14="http://schemas.microsoft.com/office/word/2010/wordml" xmlns:w15="http://schemas.microsoft.com/office/word/2012/wordml" xmlns:w16cex="http://schemas.microsoft.com/office/word/2018/wordml/cex" xmlns:w16cid="http://schemas.microsoft.com/office/word/2016/wordml/cid" xmlns:w16="http://schemas.microsoft.com/office/word/2018/wordml" xmlns:w16du="http://schemas.microsoft.com/office/word/2023/wordml/word16du" xmlns:w16sdtdh="http://schemas.microsoft.com/office/word/2020/wordml/sdtdatahash" xmlns:w16sdtfl="http://schemas.microsoft.com/office/word/2024/wordml/sdtformatlock" xmlns:w16se="http://schemas.microsoft.com/office/word/2015/wordml/symex" xmlns:wpg="http://schemas.microsoft.com/office/word/2010/wordprocessingGroup" xmlns:wpi="http://schemas.microsoft.com/office/word/2010/wordprocessingInk" xmlns:wne="http://schemas.microsoft.com/office/word/2006/wordml" xmlns:wps="http://schemas.microsoft.com/office/word/2010/wordprocessingShape" mc:Ignorable="w14 w15 w16se w16cid w16 w16cex w16sdtdh w16sdtfl w16du wp14">
+<w:document xmlns:wpc="http://schemas.microsoft.com/office/word/2010/wordprocessingCanvas" xmlns:cx="http://schemas.microsoft.com/office/drawing/2014/chartex" xmlns:cx1="http://schemas.microsoft.com/office/drawing/2015/9/8/chartex" xmlns:cx2="http://schemas.microsoft.com/office/drawing/2015/10/21/chartex" xmlns:cx3="http://schemas.microsoft.com/office/drawing/2016/5/9/chartex" xmlns:cx4="http://schemas.microsoft.com/office/drawing/2016/5/10/chartex" xmlns:cx5="http://schemas.microsoft.com/office/drawing/2016/5/11/chartex" xmlns:cx6="http://schemas.microsoft.com/office/drawing/2016/5/12/chartex" xmlns:cx7="http://schemas.microsoft.com/office/drawing/2016/5/13/chartex" xmlns:cx8="http://schemas.microsoft.com/office/drawing/2016/5/14/chartex" xmlns:mc="http://schemas.openxmlformats.org/markup-compatibility/2006" xmlns:aink="http://schemas.microsoft.com/office/drawing/2016/ink" xmlns:am3d="http://schemas.microsoft.com/office/drawing/2017/model3d" xmlns:o="urn:schemas-microsoft-com:office:office" xmlns:oel="http://schemas.microsoft.com/office/2019/extlst" xmlns:r="http://schemas.openxmlformats.org/officeDocument/2006/relationships" xmlns:m="http://schemas.openxmlformats.org/officeDocument/2006/math" xmlns:v="urn:schemas-microsoft-com:vml" xmlns:wp14="http://schemas.microsoft.com/office/word/2010/wordprocessingDrawing" xmlns:wp="http://schemas.openxmlformats.org/drawingml/2006/wordprocessingDrawing" xmlns:w10="urn:schemas-microsoft-com:office:word" xmlns:w="http://schemas.openxmlformats.org/wordprocessingml/2006/main" xmlns:w14="http://schemas.microsoft.com/office/word/2010/wordml" xmlns:w15="http://schemas.microsoft.com/office/word/2012/wordml" xmlns:w16cei="http://schemas.microsoft.com/office/word/2026/wordml/cei" xmlns:w16cex="http://schemas.microsoft.com/office/word/2018/wordml/cex" xmlns:w16cid="http://schemas.microsoft.com/office/word/2016/wordml/cid" xmlns:w16="http://schemas.microsoft.com/office/word/2018/wordml" xmlns:w16du="http://schemas.microsoft.com/office/word/2023/wordml/word16du" xmlns:w16sdtdh="http://schemas.microsoft.com/office/word/2020/wordml/sdtdatahash" xmlns:w16sdtfl="http://schemas.microsoft.com/office/word/2024/wordml/sdtformatlock" xmlns:w16se="http://schemas.microsoft.com/office/word/2015/wordml/symex" xmlns:wpg="http://schemas.microsoft.com/office/word/2010/wordprocessingGroup" xmlns:wpi="http://schemas.microsoft.com/office/word/2010/wordprocessingInk" xmlns:wne="http://schemas.microsoft.com/office/word/2006/wordml" xmlns:wps="http://schemas.microsoft.com/office/word/2010/wordprocessingShape" mc:Ignorable="w14 w15 w16se w16cid w16 w16cex w16sdtdh w16sdtfl w16du wp14">
   <w:body>
     <w:p>
       <w:pPr>
@@ -57,10 +57,10 @@
         <w:tblLook w:val="04A0" w:firstRow="1" w:lastRow="0" w:firstColumn="1" w:lastColumn="0" w:noHBand="0" w:noVBand="1"/>
       </w:tblPr>
       <w:tblGrid>
-        <w:gridCol w:w="2409"/>
-        <w:gridCol w:w="2764"/>
-        <w:gridCol w:w="2409"/>
-        <w:gridCol w:w="2606"/>
+        <w:gridCol w:w="2493"/>
+        <w:gridCol w:w="2493"/>
+        <w:gridCol w:w="2493"/>
+        <w:gridCol w:w="2493"/>
       </w:tblGrid>
       <w:tr>
         <w:tc>
@@ -203,11 +203,7 @@
           <w:tcPr>
             <w:tcW w:w="2493" w:type="dxa"/>
           </w:tcPr>
-          <w:p>
-            <w:r>
-              <w:t>{{ custody.court_order_number }}</w:t>
-            </w:r>
-          </w:p>
+          <w:p/>
         </w:tc>
         <w:tc>
           <w:tcPr>
@@ -247,7 +243,7 @@
           </w:tcPr>
           <w:p>
             <w:r>
-              <w:t>{{ custody.prison_name }}</w:t>
+              <w:t xml:space="preserve"> Ahmedabad Prison</w:t>
             </w:r>
           </w:p>
         </w:tc>
@@ -265,11 +261,7 @@
           <w:tcPr>
             <w:tcW w:w="2493" w:type="dxa"/>
           </w:tcPr>
-          <w:p>
-            <w:r>
-              <w:t>{{ custody.commitment_from }}</w:t>
-            </w:r>
-          </w:p>
+          <w:p/>
         </w:tc>
       </w:tr>
       <w:tr>
@@ -287,11 +279,7 @@
           <w:tcPr>
             <w:tcW w:w="2493" w:type="dxa"/>
           </w:tcPr>
-          <w:p>
-            <w:r>
-              <w:t>{{ custody.commitment_to }}</w:t>
-            </w:r>
-          </w:p>
+          <w:p/>
         </w:tc>
         <w:tc>
           <w:tcPr>
@@ -678,7 +666,6 @@
         <w:pStyle w:val="Heading2"/>
       </w:pPr>
       <w:r>
-        <w:lastRenderedPageBreak/>
         <w:t>Property / Articles Accompanying the Accused</w:t>
       </w:r>
     </w:p>
@@ -754,7 +741,11 @@
           </w:tcPr>
           <w:p>
             <w:r>
-              <w:t xml:space="preserve">{% for item in evidence </w:t>
+              <w:t xml:space="preserve">{% for item in </w:t>
+            </w:r>
+            <w:r>
+              <w:lastRenderedPageBreak/>
+              <w:t xml:space="preserve">evidence </w:t>
             </w:r>
             <w:proofErr w:type="gramStart"/>
             <w:r>
@@ -783,7 +774,12 @@
           </w:tcPr>
           <w:p>
             <w:r>
-              <w:t>{{ item.description }}</w:t>
+              <w:lastRenderedPageBreak/>
+              <w:t xml:space="preserve">{{ item.description </w:t>
+            </w:r>
+            <w:r>
+              <w:lastRenderedPageBreak/>
+              <w:t>}}</w:t>
             </w:r>
           </w:p>
         </w:tc>
@@ -793,7 +789,12 @@
           </w:tcPr>
           <w:p>
             <w:r>
-              <w:t>{{ item.seal_number }}</w:t>
+              <w:lastRenderedPageBreak/>
+              <w:t xml:space="preserve">{{ </w:t>
+            </w:r>
+            <w:r>
+              <w:lastRenderedPageBreak/>
+              <w:t>item.seal_number }}</w:t>
             </w:r>
           </w:p>
         </w:tc>
@@ -803,7 +804,12 @@
           </w:tcPr>
           <w:p>
             <w:r>
-              <w:t>{{ item.storage_location }}</w:t>
+              <w:lastRenderedPageBreak/>
+              <w:t xml:space="preserve">{{ </w:t>
+            </w:r>
+            <w:r>
+              <w:lastRenderedPageBreak/>
+              <w:t>item.storage_location }}</w:t>
             </w:r>
           </w:p>
         </w:tc>
@@ -950,8 +956,6 @@
             </w:r>
             <w:r>
               <w:br/>
-            </w:r>
-            <w:r>
               <w:t>Signature: __________</w:t>
             </w:r>
           </w:p>
@@ -1005,7 +1009,7 @@
 </file>
 
 <file path=word/numbering.xml><?xml version="1.0" encoding="utf-8"?>
-<w:numbering xmlns:wpc="http://schemas.microsoft.com/office/word/2010/wordprocessingCanvas" xmlns:cx="http://schemas.microsoft.com/office/drawing/2014/chartex" xmlns:cx1="http://schemas.microsoft.com/office/drawing/2015/9/8/chartex" xmlns:cx2="http://schemas.microsoft.com/office/drawing/2015/10/21/chartex" xmlns:cx3="http://schemas.microsoft.com/office/drawing/2016/5/9/chartex" xmlns:cx4="http://schemas.microsoft.com/office/drawing/2016/5/10/chartex" xmlns:cx5="http://schemas.microsoft.com/office/drawing/2016/5/11/chartex" xmlns:cx6="http://schemas.microsoft.com/office/drawing/2016/5/12/chartex" xmlns:cx7="http://schemas.microsoft.com/office/drawing/2016/5/13/chartex" xmlns:cx8="http://schemas.microsoft.com/office/drawing/2016/5/14/chartex" xmlns:mc="http://schemas.openxmlformats.org/markup-compatibility/2006" xmlns:aink="http://schemas.microsoft.com/office/drawing/2016/ink" xmlns:am3d="http://schemas.microsoft.com/office/drawing/2017/model3d" xmlns:o="urn:schemas-microsoft-com:office:office" xmlns:oel="http://schemas.microsoft.com/office/2019/extlst" xmlns:r="http://schemas.openxmlformats.org/officeDocument/2006/relationships" xmlns:m="http://schemas.openxmlformats.org/officeDocument/2006/math" xmlns:v="urn:schemas-microsoft-com:vml" xmlns:wp14="http://schemas.microsoft.com/office/word/2010/wordprocessingDrawing" xmlns:wp="http://schemas.openxmlformats.org/drawingml/2006/wordprocessingDrawing" xmlns:w10="urn:schemas-microsoft-com:office:word" xmlns:w="http://schemas.openxmlformats.org/wordprocessingml/2006/main" xmlns:w14="http://schemas.microsoft.com/office/word/2010/wordml" xmlns:w15="http://schemas.microsoft.com/office/word/2012/wordml" xmlns:w16cex="http://schemas.microsoft.com/office/word/2018/wordml/cex" xmlns:w16cid="http://schemas.microsoft.com/office/word/2016/wordml/cid" xmlns:w16="http://schemas.microsoft.com/office/word/2018/wordml" xmlns:w16du="http://schemas.microsoft.com/office/word/2023/wordml/word16du" xmlns:w16sdtdh="http://schemas.microsoft.com/office/word/2020/wordml/sdtdatahash" xmlns:w16sdtfl="http://schemas.microsoft.com/office/word/2024/wordml/sdtformatlock" xmlns:w16se="http://schemas.microsoft.com/office/word/2015/wordml/symex" xmlns:wpg="http://schemas.microsoft.com/office/word/2010/wordprocessingGroup" xmlns:wpi="http://schemas.microsoft.com/office/word/2010/wordprocessingInk" xmlns:wne="http://schemas.microsoft.com/office/word/2006/wordml" xmlns:wps="http://schemas.microsoft.com/office/word/2010/wordprocessingShape" mc:Ignorable="w14 w15 w16se w16cid w16 w16cex w16sdtdh w16sdtfl w16du wp14">
+<w:numbering xmlns:wpc="http://schemas.microsoft.com/office/word/2010/wordprocessingCanvas" xmlns:cx="http://schemas.microsoft.com/office/drawing/2014/chartex" xmlns:cx1="http://schemas.microsoft.com/office/drawing/2015/9/8/chartex" xmlns:cx2="http://schemas.microsoft.com/office/drawing/2015/10/21/chartex" xmlns:cx3="http://schemas.microsoft.com/office/drawing/2016/5/9/chartex" xmlns:cx4="http://schemas.microsoft.com/office/drawing/2016/5/10/chartex" xmlns:cx5="http://schemas.microsoft.com/office/drawing/2016/5/11/chartex" xmlns:cx6="http://schemas.microsoft.com/office/drawing/2016/5/12/chartex" xmlns:cx7="http://schemas.microsoft.com/office/drawing/2016/5/13/chartex" xmlns:cx8="http://schemas.microsoft.com/office/drawing/2016/5/14/chartex" xmlns:mc="http://schemas.openxmlformats.org/markup-compatibility/2006" xmlns:aink="http://schemas.microsoft.com/office/drawing/2016/ink" xmlns:am3d="http://schemas.microsoft.com/office/drawing/2017/model3d" xmlns:o="urn:schemas-microsoft-com:office:office" xmlns:oel="http://schemas.microsoft.com/office/2019/extlst" xmlns:r="http://schemas.openxmlformats.org/officeDocument/2006/relationships" xmlns:m="http://schemas.openxmlformats.org/officeDocument/2006/math" xmlns:v="urn:schemas-microsoft-com:vml" xmlns:wp14="http://schemas.microsoft.com/office/word/2010/wordprocessingDrawing" xmlns:wp="http://schemas.openxmlformats.org/drawingml/2006/wordprocessingDrawing" xmlns:w10="urn:schemas-microsoft-com:office:word" xmlns:w="http://schemas.openxmlformats.org/wordprocessingml/2006/main" xmlns:w14="http://schemas.microsoft.com/office/word/2010/wordml" xmlns:w15="http://schemas.microsoft.com/office/word/2012/wordml" xmlns:w16cei="http://schemas.microsoft.com/office/word/2026/wordml/cei" xmlns:w16cex="http://schemas.microsoft.com/office/word/2018/wordml/cex" xmlns:w16cid="http://schemas.microsoft.com/office/word/2016/wordml/cid" xmlns:w16="http://schemas.microsoft.com/office/word/2018/wordml" xmlns:w16du="http://schemas.microsoft.com/office/word/2023/wordml/word16du" xmlns:w16sdtdh="http://schemas.microsoft.com/office/word/2020/wordml/sdtdatahash" xmlns:w16sdtfl="http://schemas.microsoft.com/office/word/2024/wordml/sdtformatlock" xmlns:w16se="http://schemas.microsoft.com/office/word/2015/wordml/symex" xmlns:wpg="http://schemas.microsoft.com/office/word/2010/wordprocessingGroup" xmlns:wpi="http://schemas.microsoft.com/office/word/2010/wordprocessingInk" xmlns:wne="http://schemas.microsoft.com/office/word/2006/wordml" xmlns:wps="http://schemas.microsoft.com/office/word/2010/wordprocessingShape" mc:Ignorable="w14 w15 w16se w16cid w16 w16cex w16sdtdh w16sdtfl w16du wp14">
   <w:abstractNum w:abstractNumId="0" w15:restartNumberingAfterBreak="0">
     <w:nsid w:val="FFFFFF7C"/>
     <w:multiLevelType w:val="singleLevel"/>

</xml_diff>